<commit_message>
update diapo et figures
</commit_message>
<xml_diff>
--- a/diaporama/Plan diapo Agrostat.docx
+++ b/diaporama/Plan diapo Agrostat.docx
@@ -310,15 +310,13 @@
         </w:numPr>
       </w:pPr>
       <w:r>
-        <w:t xml:space="preserve">Le tableau des </w:t>
-      </w:r>
-      <w:proofErr w:type="spellStart"/>
-      <w:r>
-        <w:t>coefficientsde</w:t>
-      </w:r>
-      <w:proofErr w:type="spellEnd"/>
+        <w:t>Le tableau des coefficients</w:t>
+      </w:r>
       <w:r>
         <w:t xml:space="preserve"> </w:t>
+      </w:r>
+      <w:r>
+        <w:t xml:space="preserve">de </w:t>
       </w:r>
       <w:proofErr w:type="spellStart"/>
       <w:r>

</xml_diff>